<commit_message>
Resume: IAM Analyst(L3, L4)- Senior Associate @ PwC Acceleration Center India (MNC)
</commit_message>
<xml_diff>
--- a/resumes/Resume_IAM_Analyst_L3__L4_-_Senior_Associa_PwC_Acceleration_Center_India__MNC_.docx
+++ b/resumes/Resume_IAM_Analyst_L3__L4_-_Senior_Associa_PwC_Acceleration_Center_India__MNC_.docx
@@ -4,7 +4,7 @@
   <w:body>
     <w:p>
       <w:pPr>
-        <w:spacing w:after="44"/>
+        <w:spacing w:after="0" w:before="20"/>
         <w:jc w:val="center"/>
       </w:pPr>
       <w:r>
@@ -21,6 +21,7 @@
     </w:p>
     <w:p>
       <w:pPr>
+        <w:spacing w:before="20" w:after="0"/>
         <w:jc w:val="center"/>
       </w:pPr>
       <w:r>
@@ -116,7 +117,7 @@
         <w:pBdr>
           <w:bottom w:val="single" w:sz="6" w:space="1" w:color="000000"/>
         </w:pBdr>
-        <w:spacing w:before="360" w:after="52"/>
+        <w:spacing w:before="89" w:after="0"/>
       </w:pPr>
       <w:r>
         <w:rPr>
@@ -135,7 +136,7 @@
         <w:tabs>
           <w:tab w:val="right" w:pos="10800"/>
         </w:tabs>
-        <w:spacing w:before="62"/>
+        <w:spacing w:before="20" w:after="0"/>
       </w:pPr>
       <w:r>
         <w:rPr>
@@ -168,7 +169,7 @@
     </w:p>
     <w:p>
       <w:pPr>
-        <w:spacing w:before="8"/>
+        <w:spacing w:before="8" w:after="0"/>
       </w:pPr>
       <w:r>
         <w:rPr>
@@ -187,7 +188,7 @@
         <w:tabs>
           <w:tab w:val="right" w:pos="10800"/>
         </w:tabs>
-        <w:spacing w:before="62"/>
+        <w:spacing w:before="20" w:after="0"/>
       </w:pPr>
       <w:r>
         <w:rPr>
@@ -220,7 +221,7 @@
     </w:p>
     <w:p>
       <w:pPr>
-        <w:spacing w:before="8"/>
+        <w:spacing w:before="8" w:after="0"/>
       </w:pPr>
       <w:r>
         <w:rPr>
@@ -239,7 +240,7 @@
         <w:tabs>
           <w:tab w:val="right" w:pos="10800"/>
         </w:tabs>
-        <w:spacing w:before="62"/>
+        <w:spacing w:before="20" w:after="0"/>
       </w:pPr>
       <w:r>
         <w:rPr>
@@ -272,7 +273,7 @@
     </w:p>
     <w:p>
       <w:pPr>
-        <w:spacing w:before="8"/>
+        <w:spacing w:before="8" w:after="0"/>
       </w:pPr>
       <w:r>
         <w:rPr>
@@ -288,7 +289,7 @@
     </w:p>
     <w:p>
       <w:pPr>
-        <w:spacing w:before="8"/>
+        <w:spacing w:before="14" w:after="14"/>
       </w:pPr>
     </w:p>
     <w:p>
@@ -296,7 +297,7 @@
         <w:pBdr>
           <w:bottom w:val="single" w:sz="6" w:space="1" w:color="000000"/>
         </w:pBdr>
-        <w:spacing w:before="155" w:after="52"/>
+        <w:spacing w:before="89" w:after="0"/>
       </w:pPr>
       <w:r>
         <w:rPr>
@@ -315,7 +316,7 @@
         <w:tabs>
           <w:tab w:val="right" w:pos="10800"/>
         </w:tabs>
-        <w:spacing w:before="62"/>
+        <w:spacing w:before="20" w:after="0"/>
       </w:pPr>
       <w:r>
         <w:rPr>
@@ -359,7 +360,7 @@
         <w:tabs>
           <w:tab w:val="right" w:pos="10800"/>
         </w:tabs>
-        <w:spacing w:before="8"/>
+        <w:spacing w:before="8" w:after="0"/>
       </w:pPr>
       <w:r>
         <w:rPr>
@@ -403,34 +404,16 @@
           <w:ilvl w:val="0"/>
           <w:numId w:val="2"/>
         </w:numPr>
-        <w:spacing w:before="13" w:after="13"/>
-      </w:pPr>
-      <w:r>
-        <w:rPr>
-          <w:rFonts w:ascii="Source Sans Pro" w:eastAsia="Source Sans Pro" w:hAnsi="Source Sans Pro" w:cs="Source Sans Pro"/>
-          <w:color w:val="000000"/>
-          <w:sz w:val="19"/>
-          <w:szCs w:val="19"/>
-        </w:rPr>
-        <w:t>Triaged 50+ weekly inventory reimbursement cases by severity and policy eligibility, mirroring the structured alert triage and escalation workflow used in IAM roles.</w:t>
-      </w:r>
-      <w:proofErr w:type="spellStart"/>
-      <w:r>
-        <w:rPr>
-          <w:rFonts w:ascii="Source Sans Pro" w:eastAsia="Source Sans Pro" w:hAnsi="Source Sans Pro" w:cs="Source Sans Pro"/>
-          <w:color w:val="000000"/>
-          <w:sz w:val="19"/>
-          <w:szCs w:val="19"/>
-        </w:rPr>
-      </w:r>
-      <w:proofErr w:type="spellEnd"/>
-      <w:r>
-        <w:rPr>
-          <w:rFonts w:ascii="Source Sans Pro" w:eastAsia="Source Sans Pro" w:hAnsi="Source Sans Pro" w:cs="Source Sans Pro"/>
-          <w:color w:val="000000"/>
-          <w:sz w:val="19"/>
-          <w:szCs w:val="19"/>
-        </w:rPr>
+        <w:spacing w:before="13" w:after="27"/>
+      </w:pPr>
+      <w:r>
+        <w:rPr>
+          <w:rFonts w:ascii="Source Sans Pro" w:eastAsia="Source Sans Pro" w:hAnsi="Source Sans Pro" w:cs="Source Sans Pro"/>
+          <w:color w:val="000000"/>
+          <w:sz w:val="19"/>
+          <w:szCs w:val="19"/>
+        </w:rPr>
+        <w:t>Triaged 50+ weekly inventory reimbursement cases by severity and policy eligibility, utilizing structured alert triage and escalation workflow principles.</w:t>
       </w:r>
     </w:p>
     <w:p>
@@ -440,16 +423,16 @@
           <w:ilvl w:val="0"/>
           <w:numId w:val="2"/>
         </w:numPr>
-        <w:spacing w:before="13" w:after="13"/>
-      </w:pPr>
-      <w:r>
-        <w:rPr>
-          <w:rFonts w:ascii="Source Sans Pro" w:eastAsia="Source Sans Pro" w:hAnsi="Source Sans Pro" w:cs="Source Sans Pro"/>
-          <w:color w:val="000000"/>
-          <w:sz w:val="19"/>
-          <w:szCs w:val="19"/>
-        </w:rPr>
-        <w:t>Conducted root cause analysis on seller claims to identify policy violations and anomalous patterns; escalated findings to senior reviewers, demonstrating investigative instincts central to IAM operations.</w:t>
+        <w:spacing w:before="13" w:after="27"/>
+      </w:pPr>
+      <w:r>
+        <w:rPr>
+          <w:rFonts w:ascii="Source Sans Pro" w:eastAsia="Source Sans Pro" w:hAnsi="Source Sans Pro" w:cs="Source Sans Pro"/>
+          <w:color w:val="000000"/>
+          <w:sz w:val="19"/>
+          <w:szCs w:val="19"/>
+        </w:rPr>
+        <w:t>Conducted root cause analysis on seller claims to identify policy violations and anomalous patterns; escalated findings to senior reviewers, demonstrating investigative instincts.</w:t>
       </w:r>
     </w:p>
     <w:p>
@@ -459,91 +442,16 @@
           <w:ilvl w:val="0"/>
           <w:numId w:val="2"/>
         </w:numPr>
-        <w:spacing w:before="13" w:after="13"/>
-      </w:pPr>
-      <w:r>
-        <w:rPr>
-          <w:rFonts w:ascii="Source Sans Pro" w:eastAsia="Source Sans Pro" w:hAnsi="Source Sans Pro" w:cs="Source Sans Pro"/>
-          <w:color w:val="000000"/>
-          <w:sz w:val="19"/>
-          <w:szCs w:val="19"/>
-        </w:rPr>
-        <w:t>Maintained audit-ready case documentation recording investigation findings, decisions, and corrective actions, establishing the evidence chain-of-custody discipline required for IAM incident reporting and compliance.</w:t>
-      </w:r>
-    </w:p>
-    <w:p>
-      <w:pPr>
-        <w:pBdr>
-          <w:bottom w:val="single" w:sz="6" w:space="1" w:color="000000"/>
-        </w:pBdr>
-        <w:spacing w:before="155" w:after="52"/>
-        <w:rPr>
-          <w:rFonts w:ascii="Source Sans Pro" w:eastAsia="Source Sans Pro" w:hAnsi="Source Sans Pro" w:cs="Source Sans Pro"/>
-          <w:b/>
-          <w:bCs/>
-          <w:color w:val="000000"/>
-          <w:sz w:val="22"/>
-          <w:szCs w:val="22"/>
-        </w:rPr>
-      </w:pPr>
-    </w:p>
-    <w:p>
-      <w:pPr>
-        <w:pBdr>
-          <w:bottom w:val="single" w:sz="6" w:space="1" w:color="000000"/>
-        </w:pBdr>
-        <w:spacing w:before="155" w:after="52"/>
-      </w:pPr>
-      <w:r>
-        <w:rPr>
-          <w:rFonts w:ascii="Source Sans Pro" w:eastAsia="Source Sans Pro" w:hAnsi="Source Sans Pro" w:cs="Source Sans Pro"/>
-          <w:b/>
-          <w:bCs/>
-          <w:color w:val="000000"/>
-          <w:sz w:val="22"/>
-          <w:szCs w:val="22"/>
-        </w:rPr>
-        <w:t>Projects</w:t>
-      </w:r>
-    </w:p>
-    <w:p>
-      <w:pPr>
-        <w:tabs>
-          <w:tab w:val="right" w:pos="10800"/>
-        </w:tabs>
-        <w:spacing w:before="62"/>
-      </w:pPr>
-      <w:proofErr w:type="spellStart"/>
-      <w:proofErr w:type="spellEnd"/>
-      <w:hyperlink r:id="rId13">
-        <w:r>
-          <w:rPr>
-            <w:rFonts w:ascii="Source Sans Pro" w:eastAsia="Source Sans Pro" w:hAnsi="Source Sans Pro" w:cs="Source Sans Pro"/>
-            <w:b/>
-            <w:sz w:val="19"/>
-            <w:szCs w:val="19"/>
-            <w:color w:val="000000"/>
-            <w:u w:val="single"/>
-          </w:rPr>
-          <w:t>SOC Automation &amp; Threat Detection Lab</w:t>
-        </w:r>
-      </w:hyperlink>
-      <w:r>
-        <w:rPr>
-          <w:rFonts w:ascii="Source Sans Pro" w:eastAsia="Source Sans Pro" w:hAnsi="Source Sans Pro" w:cs="Source Sans Pro"/>
-          <w:sz w:val="19"/>
-          <w:szCs w:val="19"/>
-        </w:rPr>
-        <w:t xml:space="preserve">  |  	</w:t>
-      </w:r>
-      <w:r>
-        <w:rPr>
-          <w:rFonts w:ascii="Source Sans Pro" w:eastAsia="Source Sans Pro" w:hAnsi="Source Sans Pro" w:cs="Source Sans Pro"/>
-          <w:i/>
-          <w:sz w:val="19"/>
-          <w:szCs w:val="19"/>
-        </w:rPr>
-        <w:t>Python, Splunk, Wireshark, Nmap, MITRE ATT&amp;CK</w:t>
+        <w:spacing w:before="13" w:after="27"/>
+      </w:pPr>
+      <w:r>
+        <w:rPr>
+          <w:rFonts w:ascii="Source Sans Pro" w:eastAsia="Source Sans Pro" w:hAnsi="Source Sans Pro" w:cs="Source Sans Pro"/>
+          <w:color w:val="000000"/>
+          <w:sz w:val="19"/>
+          <w:szCs w:val="19"/>
+        </w:rPr>
+        <w:t>Maintained audit-ready case documentation recording investigation findings, decisions, and corrective actions, establishing evidence chain-of-custody discipline.</w:t>
       </w:r>
     </w:p>
     <w:p>
@@ -553,16 +461,113 @@
           <w:ilvl w:val="0"/>
           <w:numId w:val="2"/>
         </w:numPr>
-        <w:spacing w:before="13" w:after="13"/>
-      </w:pPr>
-      <w:r>
-        <w:rPr>
-          <w:rFonts w:ascii="Source Sans Pro" w:eastAsia="Source Sans Pro" w:hAnsi="Source Sans Pro" w:cs="Source Sans Pro"/>
-          <w:color w:val="000000"/>
-          <w:sz w:val="19"/>
-          <w:szCs w:val="19"/>
-        </w:rPr>
-        <w:t>Deployed Splunk SIEM with SPL correlation searches for brute-force detection, lateral movement, and privilege escalation; mapped TTPs to MITRE ATT&amp;CK (T1110, T1078, T1059) and wrote incident report.</w:t>
+        <w:spacing w:before="13" w:after="27"/>
+      </w:pPr>
+      <w:r>
+        <w:rPr>
+          <w:rFonts w:ascii="Source Sans Pro" w:eastAsia="Source Sans Pro" w:hAnsi="Source Sans Pro" w:cs="Source Sans Pro"/>
+          <w:color w:val="000000"/>
+          <w:sz w:val="19"/>
+          <w:szCs w:val="19"/>
+        </w:rPr>
+        <w:t>[[AMZ_B</w:t>
+      </w:r>
+      <w:r>
+        <w:rPr>
+          <w:rFonts w:ascii="Source Sans Pro" w:eastAsia="Source Sans Pro" w:hAnsi="Source Sans Pro" w:cs="Source Sans Pro"/>
+          <w:color w:val="000000"/>
+          <w:sz w:val="19"/>
+          <w:szCs w:val="19"/>
+        </w:rPr>
+        <w:t>4</w:t>
+      </w:r>
+      <w:r>
+        <w:rPr>
+          <w:rFonts w:ascii="Source Sans Pro" w:eastAsia="Source Sans Pro" w:hAnsi="Source Sans Pro" w:cs="Source Sans Pro"/>
+          <w:color w:val="000000"/>
+          <w:sz w:val="19"/>
+          <w:szCs w:val="19"/>
+        </w:rPr>
+        <w:t>]]</w:t>
+      </w:r>
+    </w:p>
+    <w:p>
+      <w:pPr>
+        <w:pStyle w:val="ListParagraph"/>
+        <w:spacing w:before="14" w:after="14"/>
+        <w:ind w:left="450"/>
+      </w:pPr>
+    </w:p>
+    <w:p>
+      <w:pPr>
+        <w:pStyle w:val="ListParagraph"/>
+        <w:spacing w:before="14" w:after="14"/>
+        <w:ind w:left="450"/>
+      </w:pPr>
+    </w:p>
+    <w:p>
+      <w:pPr>
+        <w:pBdr>
+          <w:bottom w:val="single" w:sz="6" w:space="1" w:color="000000"/>
+        </w:pBdr>
+        <w:spacing w:before="89" w:after="0"/>
+      </w:pPr>
+      <w:r>
+        <w:rPr>
+          <w:rFonts w:ascii="Source Sans Pro" w:eastAsia="Source Sans Pro" w:hAnsi="Source Sans Pro" w:cs="Source Sans Pro"/>
+          <w:b/>
+          <w:bCs/>
+          <w:color w:val="000000"/>
+          <w:sz w:val="22"/>
+          <w:szCs w:val="22"/>
+        </w:rPr>
+        <w:t>Projects</w:t>
+      </w:r>
+    </w:p>
+    <w:p>
+      <w:pPr>
+        <w:tabs>
+          <w:tab w:val="right" w:pos="10800"/>
+        </w:tabs>
+        <w:spacing w:before="20" w:after="0"/>
+      </w:pPr>
+      <w:hyperlink r:id="rId8">
+        <w:r>
+          <w:rPr>
+            <w:rFonts w:ascii="Source Sans Pro" w:eastAsia="Source Sans Pro" w:hAnsi="Source Sans Pro" w:cs="Source Sans Pro"/>
+            <w:b/>
+            <w:color w:val="000000"/>
+            <w:sz w:val="19"/>
+            <w:szCs w:val="19"/>
+            <w:u w:val="single"/>
+          </w:rPr>
+          <w:t>SOC Automation and Threat Detection Lab</w:t>
+        </w:r>
+      </w:hyperlink>
+      <w:r>
+        <w:rPr>
+          <w:rFonts w:ascii="Source Sans Pro" w:eastAsia="Source Sans Pro" w:hAnsi="Source Sans Pro" w:cs="Source Sans Pro"/>
+          <w:sz w:val="19"/>
+          <w:szCs w:val="19"/>
+        </w:rPr>
+        <w:t xml:space="preserve">  |  </w:t>
+      </w:r>
+      <w:r>
+        <w:rPr>
+          <w:rFonts w:ascii="Source Sans Pro" w:eastAsia="Source Sans Pro" w:hAnsi="Source Sans Pro" w:cs="Source Sans Pro"/>
+          <w:sz w:val="19"/>
+          <w:szCs w:val="19"/>
+        </w:rPr>
+        <w:tab/>
+      </w:r>
+      <w:r>
+        <w:rPr>
+          <w:rFonts w:ascii="Source Sans Pro" w:eastAsia="Source Sans Pro" w:hAnsi="Source Sans Pro" w:cs="Source Sans Pro"/>
+          <w:i/>
+          <w:sz w:val="19"/>
+          <w:szCs w:val="19"/>
+        </w:rPr>
+        <w:t>Python, Splunk, Wireshark, Nmap, MITRE ATT&amp;CK</w:t>
       </w:r>
     </w:p>
     <w:p>
@@ -572,16 +577,16 @@
           <w:ilvl w:val="0"/>
           <w:numId w:val="2"/>
         </w:numPr>
-        <w:spacing w:before="13" w:after="13"/>
-      </w:pPr>
-      <w:r>
-        <w:rPr>
-          <w:rFonts w:ascii="Source Sans Pro" w:eastAsia="Source Sans Pro" w:hAnsi="Source Sans Pro" w:cs="Source Sans Pro"/>
-          <w:color w:val="000000"/>
-          <w:sz w:val="19"/>
-          <w:szCs w:val="19"/>
-        </w:rPr>
-        <w:t>Built automated detection pipeline: Python script ingests Splunk alerts, runs IOC enrichment via VirusTotal API, and dispatches Telegram notifications with severity classification.</w:t>
+        <w:spacing w:before="13" w:after="27"/>
+      </w:pPr>
+      <w:r>
+        <w:rPr>
+          <w:rFonts w:ascii="Source Sans Pro" w:eastAsia="Source Sans Pro" w:hAnsi="Source Sans Pro" w:cs="Source Sans Pro"/>
+          <w:color w:val="000000"/>
+          <w:sz w:val="19"/>
+          <w:szCs w:val="19"/>
+        </w:rPr>
+        <w:t>Deployed Splunk SIEM with SPL searches for brute-force detection, lateral movement, and privilege escalation; mapped TTPs to MITRE ATT&amp;CK (T1110, T1078, T1059) and wrote incident report.</w:t>
       </w:r>
     </w:p>
     <w:p>
@@ -591,95 +596,16 @@
           <w:ilvl w:val="0"/>
           <w:numId w:val="2"/>
         </w:numPr>
-        <w:spacing w:before="13" w:after="13"/>
-      </w:pPr>
-      <w:r>
-        <w:rPr>
-          <w:rFonts w:ascii="Source Sans Pro" w:eastAsia="Source Sans Pro" w:hAnsi="Source Sans Pro" w:cs="Source Sans Pro"/>
-          <w:color w:val="000000"/>
-          <w:sz w:val="19"/>
-          <w:szCs w:val="19"/>
-        </w:rPr>
-        <w:t>Converted detection logic to Sigma rules; performed TCP/IP analysis in Wireshark to detect SYN scans, DNS tunnelling, and plaintext credential exposure on unencrypted sessions.</w:t>
-      </w:r>
-      <w:proofErr w:type="spellStart"/>
-      <w:r>
-        <w:rPr>
-          <w:rFonts w:ascii="Source Sans Pro" w:eastAsia="Source Sans Pro" w:hAnsi="Source Sans Pro" w:cs="Source Sans Pro"/>
-          <w:color w:val="000000"/>
-          <w:sz w:val="19"/>
-          <w:szCs w:val="19"/>
-        </w:rPr>
-      </w:r>
-      <w:proofErr w:type="spellEnd"/>
-      <w:r>
-        <w:rPr>
-          <w:rFonts w:ascii="Source Sans Pro" w:eastAsia="Source Sans Pro" w:hAnsi="Source Sans Pro" w:cs="Source Sans Pro"/>
-          <w:color w:val="000000"/>
-          <w:sz w:val="19"/>
-          <w:szCs w:val="19"/>
-        </w:rPr>
-      </w:r>
-      <w:proofErr w:type="spellStart"/>
-      <w:r>
-        <w:rPr>
-          <w:rFonts w:ascii="Source Sans Pro" w:eastAsia="Source Sans Pro" w:hAnsi="Source Sans Pro" w:cs="Source Sans Pro"/>
-          <w:color w:val="000000"/>
-          <w:sz w:val="19"/>
-          <w:szCs w:val="19"/>
-        </w:rPr>
-      </w:r>
-      <w:proofErr w:type="spellEnd"/>
-      <w:r>
-        <w:rPr>
-          <w:rFonts w:ascii="Source Sans Pro" w:eastAsia="Source Sans Pro" w:hAnsi="Source Sans Pro" w:cs="Source Sans Pro"/>
-          <w:color w:val="000000"/>
-          <w:sz w:val="19"/>
-          <w:szCs w:val="19"/>
-        </w:rPr>
-      </w:r>
-    </w:p>
-    <w:p>
-      <w:pPr>
-        <w:spacing w:before="30"/>
-      </w:pPr>
-    </w:p>
-    <w:p>
-      <w:pPr>
-        <w:tabs>
-          <w:tab w:val="right" w:pos="10800"/>
-        </w:tabs>
-        <w:spacing w:before="30"/>
-      </w:pPr>
-      <w:hyperlink r:id="rId14">
-        <w:r>
-          <w:rPr>
-            <w:rFonts w:ascii="Source Sans Pro" w:eastAsia="Source Sans Pro" w:hAnsi="Source Sans Pro" w:cs="Source Sans Pro"/>
-            <w:b/>
-            <w:sz w:val="19"/>
-            <w:szCs w:val="19"/>
-            <w:color w:val="000000"/>
-            <w:u w:val="single"/>
-          </w:rPr>
-          <w:t>Phishing &amp; OSINT Threat Intelligence Tool</w:t>
-        </w:r>
-      </w:hyperlink>
-      <w:r>
-        <w:rPr>
-          <w:rFonts w:ascii="Source Sans Pro" w:eastAsia="Source Sans Pro" w:hAnsi="Source Sans Pro" w:cs="Source Sans Pro"/>
-          <w:sz w:val="19"/>
-          <w:szCs w:val="19"/>
-        </w:rPr>
-        <w:t xml:space="preserve">  |  	</w:t>
-      </w:r>
-      <w:r>
-        <w:rPr>
-          <w:rFonts w:ascii="Source Sans Pro" w:eastAsia="Source Sans Pro" w:hAnsi="Source Sans Pro" w:cs="Source Sans Pro"/>
-          <w:i/>
-          <w:sz w:val="19"/>
-          <w:szCs w:val="19"/>
-        </w:rPr>
-        <w:t>Python, VirusTotal API, AbuseIPDB, WHOIS, Telegram bot</w:t>
+        <w:spacing w:before="13" w:after="27"/>
+      </w:pPr>
+      <w:r>
+        <w:rPr>
+          <w:rFonts w:ascii="Source Sans Pro" w:eastAsia="Source Sans Pro" w:hAnsi="Source Sans Pro" w:cs="Source Sans Pro"/>
+          <w:color w:val="000000"/>
+          <w:sz w:val="19"/>
+          <w:szCs w:val="19"/>
+        </w:rPr>
+        <w:t>Developed SOAR-style detection pipeline: Python script ingests Splunk alerts, enriches with VirusTotal IOC data, and dispatches Telegram notifications with severity classification (EPSS 9.5).</w:t>
       </w:r>
     </w:p>
     <w:p>
@@ -689,16 +615,67 @@
           <w:ilvl w:val="0"/>
           <w:numId w:val="2"/>
         </w:numPr>
-        <w:spacing w:before="13" w:after="13"/>
-      </w:pPr>
-      <w:r>
-        <w:rPr>
-          <w:rFonts w:ascii="Source Sans Pro" w:eastAsia="Source Sans Pro" w:hAnsi="Source Sans Pro" w:cs="Source Sans Pro"/>
-          <w:color w:val="000000"/>
-          <w:sz w:val="19"/>
-          <w:szCs w:val="19"/>
-        </w:rPr>
-        <w:t>Built multi-API threat intelligence pipeline: submits suspicious URLs/IPs to VirusTotal, AbuseIPDB, and URLScan.io simultaneously; cross-references WHOIS registration age, DNS records, and SSL details.</w:t>
+        <w:spacing w:before="13" w:after="27"/>
+      </w:pPr>
+      <w:r>
+        <w:rPr>
+          <w:rFonts w:ascii="Source Sans Pro" w:eastAsia="Source Sans Pro" w:hAnsi="Source Sans Pro" w:cs="Source Sans Pro"/>
+          <w:color w:val="000000"/>
+          <w:sz w:val="19"/>
+          <w:szCs w:val="19"/>
+        </w:rPr>
+        <w:t>Converted detection logic to Sigma rules (detection-as-code); performed TCP/IP analysis in Wireshark to detect SYN scans, DNS tunnelling, and plaintext credential exposure on unencrypted sessions.</w:t>
+      </w:r>
+    </w:p>
+    <w:p>
+      <w:pPr>
+        <w:spacing w:before="14" w:after="14"/>
+      </w:pPr>
+    </w:p>
+    <w:p>
+      <w:pPr>
+        <w:tabs>
+          <w:tab w:val="right" w:pos="10800"/>
+        </w:tabs>
+        <w:spacing w:before="30" w:after="0"/>
+      </w:pPr>
+      <w:hyperlink r:id="rId9">
+        <w:r>
+          <w:rPr>
+            <w:rFonts w:ascii="Source Sans Pro" w:eastAsia="Source Sans Pro" w:hAnsi="Source Sans Pro" w:cs="Source Sans Pro"/>
+            <w:b/>
+            <w:color w:val="000000"/>
+            <w:sz w:val="19"/>
+            <w:szCs w:val="19"/>
+            <w:u w:val="single"/>
+          </w:rPr>
+          <w:t>Phishing and OSINT Threat Intelligence Tool</w:t>
+        </w:r>
+      </w:hyperlink>
+      <w:r>
+        <w:rPr>
+          <w:rFonts w:ascii="Source Sans Pro" w:eastAsia="Source Sans Pro" w:hAnsi="Source Sans Pro" w:cs="Source Sans Pro"/>
+          <w:sz w:val="19"/>
+          <w:szCs w:val="19"/>
+        </w:rPr>
+        <w:t xml:space="preserve">  |  </w:t>
+      </w:r>
+      <w:r>
+        <w:rPr>
+          <w:rFonts w:ascii="Source Sans Pro" w:eastAsia="Source Sans Pro" w:hAnsi="Source Sans Pro" w:cs="Source Sans Pro"/>
+          <w:sz w:val="19"/>
+          <w:szCs w:val="19"/>
+        </w:rPr>
+        <w:tab/>
+      </w:r>
+      <w:r>
+        <w:rPr>
+          <w:rFonts w:ascii="Source Sans Pro" w:eastAsia="Source Sans Pro" w:hAnsi="Source Sans Pro" w:cs="Source Sans Pro"/>
+          <w:i/>
+          <w:sz w:val="19"/>
+          <w:szCs w:val="19"/>
+        </w:rPr>
+        <w:t>Python, VirusTotal API, AbuseIPDB, WHOIS, Telegram bot</w:t>
       </w:r>
     </w:p>
     <w:p>
@@ -708,16 +685,16 @@
           <w:ilvl w:val="0"/>
           <w:numId w:val="2"/>
         </w:numPr>
-        <w:spacing w:before="13" w:after="13"/>
-      </w:pPr>
-      <w:r>
-        <w:rPr>
-          <w:rFonts w:ascii="Source Sans Pro" w:eastAsia="Source Sans Pro" w:hAnsi="Source Sans Pro" w:cs="Source Sans Pro"/>
-          <w:color w:val="000000"/>
-          <w:sz w:val="19"/>
-          <w:szCs w:val="19"/>
-        </w:rPr>
-        <w:t>Implemented typosquatting domain detector generating character-substitution variants of brand domains and checking live DNS resolution — catches brand-impersonation attacks.</w:t>
+        <w:spacing w:before="13" w:after="27"/>
+      </w:pPr>
+      <w:r>
+        <w:rPr>
+          <w:rFonts w:ascii="Source Sans Pro" w:eastAsia="Source Sans Pro" w:hAnsi="Source Sans Pro" w:cs="Source Sans Pro"/>
+          <w:color w:val="000000"/>
+          <w:sz w:val="19"/>
+          <w:szCs w:val="19"/>
+        </w:rPr>
+        <w:t>Built multi-API threat intelligence pipeline: submits suspicious data to VirusTotal, AbuseIPDB, and URLScan.io; cross-references WHOIS, DNS, and SSL details.</w:t>
       </w:r>
     </w:p>
     <w:p>
@@ -727,196 +704,16 @@
           <w:ilvl w:val="0"/>
           <w:numId w:val="2"/>
         </w:numPr>
-        <w:spacing w:before="13" w:after="13"/>
-      </w:pPr>
-      <w:r>
-        <w:rPr>
-          <w:rFonts w:ascii="Source Sans Pro" w:eastAsia="Source Sans Pro" w:hAnsi="Source Sans Pro" w:cs="Source Sans Pro"/>
-          <w:color w:val="000000"/>
-          <w:sz w:val="19"/>
-          <w:szCs w:val="19"/>
-        </w:rPr>
-        <w:t>Deployed Telegram bot interface enabling analysts to submit URLs for live IOC enrichment; supports bulk CSV input/output for incident response workflows.</w:t>
-      </w:r>
-    </w:p>
-    <w:p>
-      <w:pPr>
-        <w:pBdr>
-          <w:bottom w:val="single" w:sz="6" w:space="1" w:color="000000"/>
-        </w:pBdr>
-        <w:spacing w:before="155" w:after="52"/>
-        <w:rPr>
-          <w:rFonts w:ascii="Source Sans Pro" w:eastAsia="Source Sans Pro" w:hAnsi="Source Sans Pro" w:cs="Source Sans Pro"/>
-          <w:b/>
-          <w:bCs/>
-          <w:color w:val="000000"/>
-          <w:sz w:val="22"/>
-          <w:szCs w:val="22"/>
-        </w:rPr>
-      </w:pPr>
-    </w:p>
-    <w:p>
-      <w:pPr>
-        <w:pBdr>
-          <w:bottom w:val="single" w:sz="6" w:space="1" w:color="000000"/>
-        </w:pBdr>
-        <w:spacing w:before="155" w:after="52"/>
-      </w:pPr>
-      <w:r>
-        <w:rPr>
-          <w:rFonts w:ascii="Source Sans Pro" w:eastAsia="Source Sans Pro" w:hAnsi="Source Sans Pro" w:cs="Source Sans Pro"/>
-          <w:b/>
-          <w:bCs/>
-          <w:color w:val="000000"/>
-          <w:sz w:val="22"/>
-          <w:szCs w:val="22"/>
-        </w:rPr>
-        <w:t>Technical Skills</w:t>
-      </w:r>
-    </w:p>
-    <w:p>
-      <w:pPr>
-        <w:spacing w:before="24" w:after="24"/>
-      </w:pPr>
-      <w:r>
-        <w:rPr>
-          <w:rFonts w:ascii="Source Sans Pro" w:eastAsia="Source Sans Pro" w:hAnsi="Source Sans Pro" w:cs="Source Sans Pro"/>
-          <w:b/>
-          <w:sz w:val="19"/>
-          <w:szCs w:val="19"/>
-        </w:rPr>
-        <w:t xml:space="preserve">SOC Operations: </w:t>
-      </w:r>
-      <w:r>
-        <w:rPr>
-          <w:rFonts w:ascii="Source Sans Pro" w:eastAsia="Source Sans Pro" w:hAnsi="Source Sans Pro" w:cs="Source Sans Pro"/>
-          <w:sz w:val="19"/>
-          <w:szCs w:val="19"/>
-        </w:rPr>
-        <w:t>Alert triage, incident investigation, log analysis, threat detection, escalation, false positive analysis</w:t>
-      </w:r>
-    </w:p>
-    <w:p>
-      <w:pPr>
-        <w:spacing w:before="24" w:after="24"/>
-      </w:pPr>
-      <w:r>
-        <w:rPr>
-          <w:rFonts w:ascii="Source Sans Pro" w:eastAsia="Source Sans Pro" w:hAnsi="Source Sans Pro" w:cs="Source Sans Pro"/>
-          <w:b/>
-          <w:sz w:val="19"/>
-          <w:szCs w:val="19"/>
-        </w:rPr>
-        <w:t xml:space="preserve">SIEM &amp; Monitoring: </w:t>
-      </w:r>
-      <w:r>
-        <w:rPr>
-          <w:rFonts w:ascii="Source Sans Pro" w:eastAsia="Source Sans Pro" w:hAnsi="Source Sans Pro" w:cs="Source Sans Pro"/>
-          <w:sz w:val="19"/>
-          <w:szCs w:val="19"/>
-        </w:rPr>
-        <w:t>Splunk (SPL), Elastic SIEM (basic), Windows Event Logs, Sysmon, Wireshark</w:t>
-      </w:r>
-    </w:p>
-    <w:p>
-      <w:pPr>
-        <w:spacing w:before="24" w:after="24"/>
-      </w:pPr>
-      <w:r>
-        <w:rPr>
-          <w:rFonts w:ascii="Source Sans Pro" w:eastAsia="Source Sans Pro" w:hAnsi="Source Sans Pro" w:cs="Source Sans Pro"/>
-          <w:b/>
-          <w:sz w:val="19"/>
-          <w:szCs w:val="19"/>
-        </w:rPr>
-        <w:t xml:space="preserve">Threat Intelligence: </w:t>
-      </w:r>
-      <w:r>
-        <w:rPr>
-          <w:rFonts w:ascii="Source Sans Pro" w:eastAsia="Source Sans Pro" w:hAnsi="Source Sans Pro" w:cs="Source Sans Pro"/>
-          <w:sz w:val="19"/>
-          <w:szCs w:val="19"/>
-        </w:rPr>
-        <w:t>MITRE ATT&amp;CK, IOC analysis, VirusTotal, OSINT enrichment, Cyber Kill Chain</w:t>
-      </w:r>
-    </w:p>
-    <w:p>
-      <w:pPr>
-        <w:spacing w:before="24" w:after="24"/>
-      </w:pPr>
-      <w:r>
-        <w:rPr>
-          <w:rFonts w:ascii="Source Sans Pro" w:eastAsia="Source Sans Pro" w:hAnsi="Source Sans Pro" w:cs="Source Sans Pro"/>
-          <w:b/>
-          <w:sz w:val="19"/>
-          <w:szCs w:val="19"/>
-        </w:rPr>
-        <w:t xml:space="preserve">Systems &amp; Networking: </w:t>
-      </w:r>
-      <w:r>
-        <w:rPr>
-          <w:rFonts w:ascii="Source Sans Pro" w:eastAsia="Source Sans Pro" w:hAnsi="Source Sans Pro" w:cs="Source Sans Pro"/>
-          <w:sz w:val="19"/>
-          <w:szCs w:val="19"/>
-        </w:rPr>
-        <w:t>Windows internals, Linux fundamentals, TCP/IP, DNS, HTTP/S, IDS/IPS, AWS (IAM, CloudTrail, GuardDuty basics)</w:t>
-      </w:r>
-    </w:p>
-    <w:p>
-      <w:pPr>
-        <w:spacing w:before="24" w:after="24"/>
-      </w:pPr>
-      <w:r>
-        <w:rPr>
-          <w:rFonts w:ascii="Source Sans Pro" w:eastAsia="Source Sans Pro" w:hAnsi="Source Sans Pro" w:cs="Source Sans Pro"/>
-          <w:b/>
-          <w:sz w:val="19"/>
-          <w:szCs w:val="19"/>
-        </w:rPr>
-        <w:t xml:space="preserve">Automation: </w:t>
-      </w:r>
-      <w:r>
-        <w:rPr>
-          <w:rFonts w:ascii="Source Sans Pro" w:eastAsia="Source Sans Pro" w:hAnsi="Source Sans Pro" w:cs="Source Sans Pro"/>
-          <w:sz w:val="19"/>
-          <w:szCs w:val="19"/>
-        </w:rPr>
-        <w:t>Python, Bash (basic), boto3, regular expressions</w:t>
-      </w:r>
-    </w:p>
-    <w:p>
-      <w:pPr>
-        <w:pBdr>
-          <w:bottom w:val="single" w:sz="6" w:space="1" w:color="000000"/>
-        </w:pBdr>
-        <w:spacing w:before="155" w:after="52"/>
-        <w:rPr>
-          <w:rFonts w:ascii="Source Sans Pro" w:eastAsia="Source Sans Pro" w:hAnsi="Source Sans Pro" w:cs="Source Sans Pro"/>
-          <w:b/>
-          <w:bCs/>
-          <w:color w:val="000000"/>
-          <w:sz w:val="22"/>
-          <w:szCs w:val="22"/>
-        </w:rPr>
-      </w:pPr>
-    </w:p>
-    <w:p>
-      <w:pPr>
-        <w:pBdr>
-          <w:bottom w:val="single" w:sz="6" w:space="1" w:color="000000"/>
-        </w:pBdr>
-        <w:spacing w:before="155" w:after="52"/>
-      </w:pPr>
-      <w:r>
-        <w:rPr>
-          <w:rFonts w:ascii="Source Sans Pro" w:eastAsia="Source Sans Pro" w:hAnsi="Source Sans Pro" w:cs="Source Sans Pro"/>
-          <w:b/>
-          <w:bCs/>
-          <w:color w:val="000000"/>
-          <w:sz w:val="22"/>
-          <w:szCs w:val="22"/>
-        </w:rPr>
-        <w:t>Certifications</w:t>
+        <w:spacing w:before="13" w:after="27"/>
+      </w:pPr>
+      <w:r>
+        <w:rPr>
+          <w:rFonts w:ascii="Source Sans Pro" w:eastAsia="Source Sans Pro" w:hAnsi="Source Sans Pro" w:cs="Source Sans Pro"/>
+          <w:color w:val="000000"/>
+          <w:sz w:val="19"/>
+          <w:szCs w:val="19"/>
+        </w:rPr>
+        <w:t>Implemented typosquatting (brand impersonation detection) domain detector generating character-substitution variants of brand domains and checking live DNS resolution.</w:t>
       </w:r>
     </w:p>
     <w:p>
@@ -926,16 +723,187 @@
           <w:ilvl w:val="0"/>
           <w:numId w:val="2"/>
         </w:numPr>
-        <w:spacing w:before="13" w:after="13"/>
-      </w:pPr>
-      <w:r>
-        <w:rPr>
-          <w:rFonts w:ascii="Source Sans Pro" w:eastAsia="Source Sans Pro" w:hAnsi="Source Sans Pro" w:cs="Source Sans Pro"/>
-          <w:color w:val="000000"/>
-          <w:sz w:val="19"/>
-          <w:szCs w:val="19"/>
-        </w:rPr>
-        <w:t>CompTIA Security+ SY0-701  —  in progress, exam target Q3 2026</w:t>
+        <w:spacing w:before="13" w:after="27"/>
+      </w:pPr>
+      <w:r>
+        <w:rPr>
+          <w:rFonts w:ascii="Source Sans Pro" w:eastAsia="Source Sans Pro" w:hAnsi="Source Sans Pro" w:cs="Source Sans Pro"/>
+          <w:color w:val="000000"/>
+          <w:sz w:val="19"/>
+          <w:szCs w:val="19"/>
+        </w:rPr>
+        <w:t>Deployed Telegram bot interface for live IOC enrichment, supporting bulk CSV input/output and OSINT enrichment via theHarvester.</w:t>
+      </w:r>
+    </w:p>
+    <w:p>
+      <w:pPr>
+        <w:pStyle w:val="ListParagraph"/>
+        <w:spacing w:before="14" w:after="14"/>
+        <w:ind w:left="450"/>
+      </w:pPr>
+    </w:p>
+    <w:p>
+      <w:pPr>
+        <w:pBdr>
+          <w:bottom w:val="single" w:sz="6" w:space="1" w:color="000000"/>
+        </w:pBdr>
+        <w:spacing w:before="89" w:after="0"/>
+      </w:pPr>
+      <w:r>
+        <w:rPr>
+          <w:rFonts w:ascii="Source Sans Pro" w:eastAsia="Source Sans Pro" w:hAnsi="Source Sans Pro" w:cs="Source Sans Pro"/>
+          <w:b/>
+          <w:bCs/>
+          <w:color w:val="000000"/>
+          <w:sz w:val="22"/>
+          <w:szCs w:val="22"/>
+        </w:rPr>
+        <w:t>Technical Skills</w:t>
+      </w:r>
+    </w:p>
+    <w:p>
+      <w:pPr>
+        <w:spacing w:before="41" w:after="41"/>
+      </w:pPr>
+      <w:r>
+        <w:rPr>
+          <w:rFonts w:ascii="Source Sans Pro" w:eastAsia="Source Sans Pro" w:hAnsi="Source Sans Pro" w:cs="Source Sans Pro"/>
+          <w:b/>
+          <w:sz w:val="19"/>
+          <w:szCs w:val="19"/>
+        </w:rPr>
+        <w:t xml:space="preserve">SOC Operations: </w:t>
+      </w:r>
+      <w:r>
+        <w:rPr>
+          <w:rFonts w:ascii="Source Sans Pro" w:eastAsia="Source Sans Pro" w:hAnsi="Source Sans Pro" w:cs="Source Sans Pro"/>
+          <w:sz w:val="19"/>
+          <w:szCs w:val="19"/>
+        </w:rPr>
+        <w:t>Alert triage, incident investigation, log analysis, threat detection, escalation, false positive analysis</w:t>
+      </w:r>
+    </w:p>
+    <w:p>
+      <w:pPr>
+        <w:spacing w:before="41" w:after="41"/>
+      </w:pPr>
+      <w:r>
+        <w:rPr>
+          <w:rFonts w:ascii="Source Sans Pro" w:eastAsia="Source Sans Pro" w:hAnsi="Source Sans Pro" w:cs="Source Sans Pro"/>
+          <w:b/>
+          <w:sz w:val="19"/>
+          <w:szCs w:val="19"/>
+        </w:rPr>
+        <w:t xml:space="preserve">SIEM &amp; Monitoring: </w:t>
+      </w:r>
+      <w:r>
+        <w:rPr>
+          <w:rFonts w:ascii="Source Sans Pro" w:eastAsia="Source Sans Pro" w:hAnsi="Source Sans Pro" w:cs="Source Sans Pro"/>
+          <w:sz w:val="19"/>
+          <w:szCs w:val="19"/>
+        </w:rPr>
+        <w:t>Splunk (SPL), Elastic SIEM (basic), Windows Event Logs, Sysmon, Wireshark</w:t>
+      </w:r>
+    </w:p>
+    <w:p>
+      <w:pPr>
+        <w:spacing w:before="41" w:after="41"/>
+      </w:pPr>
+      <w:r>
+        <w:rPr>
+          <w:rFonts w:ascii="Source Sans Pro" w:eastAsia="Source Sans Pro" w:hAnsi="Source Sans Pro" w:cs="Source Sans Pro"/>
+          <w:b/>
+          <w:sz w:val="19"/>
+          <w:szCs w:val="19"/>
+        </w:rPr>
+        <w:t xml:space="preserve">Threat Intelligence: </w:t>
+      </w:r>
+      <w:r>
+        <w:rPr>
+          <w:rFonts w:ascii="Source Sans Pro" w:eastAsia="Source Sans Pro" w:hAnsi="Source Sans Pro" w:cs="Source Sans Pro"/>
+          <w:sz w:val="19"/>
+          <w:szCs w:val="19"/>
+        </w:rPr>
+        <w:t>MITRE ATT&amp;CK, IOC analysis, VirusTotal, OSINT enrichment, Cyber Kill Chain</w:t>
+      </w:r>
+    </w:p>
+    <w:p>
+      <w:pPr>
+        <w:spacing w:before="41" w:after="41"/>
+      </w:pPr>
+      <w:r>
+        <w:rPr>
+          <w:rFonts w:ascii="Source Sans Pro" w:eastAsia="Source Sans Pro" w:hAnsi="Source Sans Pro" w:cs="Source Sans Pro"/>
+          <w:b/>
+          <w:sz w:val="19"/>
+          <w:szCs w:val="19"/>
+        </w:rPr>
+        <w:t xml:space="preserve">Systems &amp; Networking: </w:t>
+      </w:r>
+      <w:r>
+        <w:rPr>
+          <w:rFonts w:ascii="Source Sans Pro" w:eastAsia="Source Sans Pro" w:hAnsi="Source Sans Pro" w:cs="Source Sans Pro"/>
+          <w:sz w:val="19"/>
+          <w:szCs w:val="19"/>
+        </w:rPr>
+        <w:t>Windows internals, Linux fundamentals, TCP/IP, DNS, HTTP/S, IDS/IPS, AWS (IAM, CloudTrail, GuardDuty), cloud security posture</w:t>
+      </w:r>
+    </w:p>
+    <w:p>
+      <w:pPr>
+        <w:spacing w:before="41" w:after="41"/>
+      </w:pPr>
+      <w:r>
+        <w:rPr>
+          <w:rFonts w:ascii="Source Sans Pro" w:eastAsia="Source Sans Pro" w:hAnsi="Source Sans Pro" w:cs="Source Sans Pro"/>
+          <w:b/>
+          <w:sz w:val="19"/>
+          <w:szCs w:val="19"/>
+        </w:rPr>
+        <w:t xml:space="preserve">Automation: </w:t>
+      </w:r>
+      <w:r>
+        <w:rPr>
+          <w:rFonts w:ascii="Source Sans Pro" w:eastAsia="Source Sans Pro" w:hAnsi="Source Sans Pro" w:cs="Source Sans Pro"/>
+          <w:sz w:val="19"/>
+          <w:szCs w:val="19"/>
+        </w:rPr>
+        <w:t>Python, Bash (basic), boto3, regular expressions, Access Control, Compliance, Active Directory</w:t>
+      </w:r>
+    </w:p>
+    <w:p>
+      <w:pPr>
+        <w:pBdr>
+          <w:bottom w:val="single" w:sz="6" w:space="1" w:color="000000"/>
+        </w:pBdr>
+        <w:spacing w:before="14" w:after="14"/>
+        <w:rPr>
+          <w:rFonts w:ascii="Source Sans Pro" w:eastAsia="Source Sans Pro" w:hAnsi="Source Sans Pro" w:cs="Source Sans Pro"/>
+          <w:b/>
+          <w:bCs/>
+          <w:color w:val="000000"/>
+          <w:sz w:val="22"/>
+          <w:szCs w:val="22"/>
+        </w:rPr>
+      </w:pPr>
+    </w:p>
+    <w:p>
+      <w:pPr>
+        <w:pBdr>
+          <w:bottom w:val="single" w:sz="6" w:space="1" w:color="000000"/>
+        </w:pBdr>
+        <w:spacing w:before="89" w:after="0"/>
+      </w:pPr>
+      <w:r>
+        <w:rPr>
+          <w:rFonts w:ascii="Source Sans Pro" w:eastAsia="Source Sans Pro" w:hAnsi="Source Sans Pro" w:cs="Source Sans Pro"/>
+          <w:b/>
+          <w:bCs/>
+          <w:color w:val="000000"/>
+          <w:sz w:val="22"/>
+          <w:szCs w:val="22"/>
+        </w:rPr>
+        <w:t>Certifications</w:t>
       </w:r>
     </w:p>
     <w:p>
@@ -945,7 +913,26 @@
           <w:ilvl w:val="0"/>
           <w:numId w:val="2"/>
         </w:numPr>
-        <w:spacing w:before="13" w:after="13"/>
+        <w:spacing w:before="13" w:after="27"/>
+      </w:pPr>
+      <w:r>
+        <w:rPr>
+          <w:rFonts w:ascii="Source Sans Pro" w:eastAsia="Source Sans Pro" w:hAnsi="Source Sans Pro" w:cs="Source Sans Pro"/>
+          <w:color w:val="000000"/>
+          <w:sz w:val="19"/>
+          <w:szCs w:val="19"/>
+        </w:rPr>
+        <w:t>CompTIA Security+ SY0-701  —  in progress, exam target Q3 2026</w:t>
+      </w:r>
+    </w:p>
+    <w:p>
+      <w:pPr>
+        <w:pStyle w:val="ListParagraph"/>
+        <w:numPr>
+          <w:ilvl w:val="0"/>
+          <w:numId w:val="2"/>
+        </w:numPr>
+        <w:spacing w:before="13" w:after="27"/>
       </w:pPr>
       <w:r>
         <w:rPr>

</xml_diff>